<commit_message>
analysis updates and game data rebalancing
</commit_message>
<xml_diff>
--- a/publication/IJSG_draft.docx
+++ b/publication/IJSG_draft.docx
@@ -2212,6 +2212,7 @@
       <w:r>
         <w:rPr>
           <w:rFonts w:eastAsia="Times New Roman"/>
+          <w:noProof/>
           <w:sz w:val="24"/>
           <w:szCs w:val="24"/>
           <w:lang w:val="en-US" w:eastAsia="de-DE"/>
@@ -3541,13 +3542,7 @@
                       <w:rPr>
                         <w:rFonts w:ascii="Cambria Math" w:hAnsi="Cambria Math"/>
                       </w:rPr>
-                      <m:t>(</m:t>
-                    </m:r>
-                    <m:r>
-                      <w:rPr>
-                        <w:rFonts w:ascii="Cambria Math" w:hAnsi="Cambria Math"/>
-                      </w:rPr>
-                      <m:t>A</m:t>
+                      <m:t>(A</m:t>
                     </m:r>
                   </m:e>
                   <m:sub>
@@ -5672,10 +5667,10 @@
         <w:tblLook w:val="04A0" w:firstRow="1" w:lastRow="0" w:firstColumn="1" w:lastColumn="0" w:noHBand="0" w:noVBand="1"/>
       </w:tblPr>
       <w:tblGrid>
-        <w:gridCol w:w="1707"/>
-        <w:gridCol w:w="1998"/>
-        <w:gridCol w:w="1461"/>
-        <w:gridCol w:w="3482"/>
+        <w:gridCol w:w="1706"/>
+        <w:gridCol w:w="2009"/>
+        <w:gridCol w:w="1459"/>
+        <w:gridCol w:w="3474"/>
       </w:tblGrid>
       <w:tr>
         <w:trPr>
@@ -6486,15 +6481,7 @@
                   <w:sz w:val="24"/>
                   <w:szCs w:val="22"/>
                 </w:rPr>
-                <m:t>=</m:t>
-              </m:r>
-              <m:r>
-                <w:rPr>
-                  <w:rFonts w:ascii="Cambria Math" w:hAnsi="Cambria Math"/>
-                  <w:sz w:val="24"/>
-                  <w:szCs w:val="22"/>
-                </w:rPr>
-                <m:t>Q</m:t>
+                <m:t>=Q</m:t>
               </m:r>
             </m:e>
             <m:sub>
@@ -7569,13 +7556,7 @@
             <w:rPr>
               <w:rFonts w:ascii="Cambria Math" w:hAnsi="Cambria Math"/>
             </w:rPr>
-            <m:t xml:space="preserve">(p), </m:t>
-          </m:r>
-          <m:r>
-            <w:rPr>
-              <w:rFonts w:ascii="Cambria Math" w:hAnsi="Cambria Math"/>
-            </w:rPr>
-            <m:t>S</m:t>
+            <m:t>(p), S</m:t>
           </m:r>
           <m:d>
             <m:dPr>
@@ -7598,13 +7579,7 @@
             <w:rPr>
               <w:rFonts w:ascii="Cambria Math" w:hAnsi="Cambria Math"/>
             </w:rPr>
-            <m:t>)</m:t>
-          </m:r>
-          <m:r>
-            <w:rPr>
-              <w:rFonts w:ascii="Cambria Math" w:hAnsi="Cambria Math"/>
-            </w:rPr>
-            <m:t>,</m:t>
+            <m:t>),</m:t>
           </m:r>
         </m:oMath>
       </m:oMathPara>
@@ -8848,14 +8823,7 @@
           <w:szCs w:val="22"/>
           <w:lang w:eastAsia="de-DE"/>
         </w:rPr>
-        <w:t>The analysis evaluates the final state after round four and records the complete card history of each game.</w:t>
-      </w:r>
-      <w:r>
-        <w:rPr>
-          <w:szCs w:val="22"/>
-          <w:lang w:eastAsia="de-DE"/>
-        </w:rPr>
-        <w:t xml:space="preserve"> </w:t>
+        <w:t xml:space="preserve">The analysis evaluates the final state after round four and records the complete card history of each game. </w:t>
       </w:r>
       <w:r>
         <w:rPr>
@@ -9025,16 +8993,7 @@
             <w:rPr>
               <w:rFonts w:ascii="Cambria Math" w:hAnsi="Cambria Math"/>
             </w:rPr>
-            <m:t xml:space="preserve"> </m:t>
-          </m:r>
-          <m:r>
-            <m:rPr>
-              <m:sty m:val="p"/>
-            </m:rPr>
-            <w:rPr>
-              <w:rFonts w:ascii="Cambria Math" w:hAnsi="Cambria Math"/>
-            </w:rPr>
-            <m:t>Δ</m:t>
+            <m:t xml:space="preserve"> Δ</m:t>
           </m:r>
           <m:r>
             <w:rPr>
@@ -9414,6 +9373,7 @@
       </w:pPr>
       <w:r>
         <w:rPr>
+          <w:noProof/>
           <w:lang w:val="en-US"/>
         </w:rPr>
         <w:drawing>
@@ -9507,6 +9467,7 @@
       </w:pPr>
       <w:r>
         <w:rPr>
+          <w:noProof/>
           <w:lang w:val="en-US"/>
         </w:rPr>
         <w:drawing>
@@ -9605,6 +9566,9 @@
         <w:pStyle w:val="Articlenormaltext"/>
       </w:pPr>
       <w:r>
+        <w:rPr>
+          <w:noProof/>
+        </w:rPr>
         <w:lastRenderedPageBreak/>
         <w:drawing>
           <wp:inline distT="0" distB="0" distL="0" distR="0" wp14:anchorId="11942BDE" wp14:editId="4B971314">
@@ -9684,14 +9648,17 @@
     </w:p>
     <w:p>
       <w:pPr>
-        <w:pStyle w:val="Articlenormaltext"/>
-      </w:pPr>
-      <w:r>
+        <w:pStyle w:val="Articlenormaltextfirstparagraph"/>
+      </w:pPr>
+      <w:r>
+        <w:rPr>
+          <w:noProof/>
+        </w:rPr>
         <w:drawing>
-          <wp:inline distT="0" distB="0" distL="0" distR="0" wp14:anchorId="4B9BC0FF" wp14:editId="260A11B3">
-            <wp:extent cx="5491480" cy="3871595"/>
-            <wp:effectExtent l="0" t="0" r="0" b="0"/>
-            <wp:docPr id="2046722341" name="Grafik 1"/>
+          <wp:inline distT="0" distB="0" distL="0" distR="0" wp14:anchorId="2896AFAF" wp14:editId="05B883FF">
+            <wp:extent cx="5491480" cy="4773930"/>
+            <wp:effectExtent l="0" t="0" r="0" b="7620"/>
+            <wp:docPr id="133462877" name="Grafik 1"/>
             <wp:cNvGraphicFramePr>
               <a:graphicFrameLocks xmlns:a="http://schemas.openxmlformats.org/drawingml/2006/main" noChangeAspect="1"/>
             </wp:cNvGraphicFramePr>
@@ -9699,7 +9666,7 @@
               <a:graphicData uri="http://schemas.openxmlformats.org/drawingml/2006/picture">
                 <pic:pic xmlns:pic="http://schemas.openxmlformats.org/drawingml/2006/picture">
                   <pic:nvPicPr>
-                    <pic:cNvPr id="2046722341" name=""/>
+                    <pic:cNvPr id="133462877" name=""/>
                     <pic:cNvPicPr/>
                   </pic:nvPicPr>
                   <pic:blipFill>
@@ -9711,7 +9678,7 @@
                   <pic:spPr>
                     <a:xfrm>
                       <a:off x="0" y="0"/>
-                      <a:ext cx="5491480" cy="3871595"/>
+                      <a:ext cx="5491480" cy="4773930"/>
                     </a:xfrm>
                     <a:prstGeom prst="rect">
                       <a:avLst/>
@@ -9769,6 +9736,7 @@
         <w:pStyle w:val="berschrift2"/>
       </w:pPr>
       <w:r>
+        <w:lastRenderedPageBreak/>
         <w:t>4.5 Evidence for interaction rather than independent card ranking</w:t>
       </w:r>
     </w:p>
@@ -9777,11 +9745,136 @@
         <w:pStyle w:val="Articlenormaltextfirstparagraph"/>
       </w:pPr>
       <w:r>
-        <w:t>The simulated high-performing games generally contained combinations of measures from multiple state dimensions rather than only repeated selection from one category. For example, the best observed trajectory combined envelope renovation, window improvement, heat-</w:t>
-      </w:r>
+        <w:t>The simulated high-performing games generally contained combinations of measures from multiple state dimensions rather than only repeated selection from one category. For example, the best observed trajectory combined envelope renovation, window improvement, heat-distribution and heat-generation measures with photovoltaic generation, electrical efficiency, flexibility, and user-oriented interventions.</w:t>
+      </w:r>
+    </w:p>
+    <w:p>
+      <w:pPr>
+        <w:pStyle w:val="Articlenormaltext"/>
+      </w:pPr>
+      <w:r>
+        <w:t>This pattern is consistent with the intended structure of the model, in which the result of a measure can depend on other states. Heat-pump outcomes depend on thermal demand and efficiency; storage interacts with local generation; and budget effects influence the availability of later measures. Consequently, the frequency of an individual card cannot be interpreted as an independent measure of technical effectiveness.</w:t>
+      </w:r>
+    </w:p>
+    <w:p>
+      <w:pPr>
+        <w:pStyle w:val="Articlenormaltext"/>
+      </w:pPr>
+      <w:r>
+        <w:t>The exploratory card-level analysis confirms this limitation. Comparing the mean final score of games with and without a specific card produces large apparent differences for some measures, but these differences include selection effects from budget, prerequisites, card availability, and previous measures. Such comparisons are therefore useful as balancing diagnostics rather than causal estimates of card effectiveness.</w:t>
+      </w:r>
+    </w:p>
+    <w:p>
+      <w:pPr>
+        <w:pStyle w:val="berschrift2"/>
+      </w:pPr>
+      <w:r>
+        <w:t>Implications for model calibration</w:t>
+      </w:r>
+    </w:p>
+    <w:p>
+      <w:pPr>
+        <w:pStyle w:val="Articlenormaltextfirstparagraph"/>
+      </w:pPr>
+      <w:r>
+        <w:t xml:space="preserve">Overall, the simulation provides two complementary findings. </w:t>
+      </w:r>
+      <w:r>
+        <w:t>First, the major single-use building systems show substantial pathway diversity: several envelope, heat-generation, ventilation, heat-distribution, and roof-use options occur among the best-performing trajectories. This supports the design objective of avoiding one universally prescribed renovation pathway.</w:t>
+      </w:r>
+    </w:p>
+    <w:p>
+      <w:pPr>
+        <w:pStyle w:val="Articlenormaltext"/>
+      </w:pPr>
+      <w:r>
+        <w:t>Second, the analysis identifies specific areas for further calibration. Storage and flexibility frequently reach the maximum state, indicating a possible ceiling effect. Several enabling cards occur disproportionately often among the best-performing trajectories, particularly the house-wide electric-car charging infrastructure. These findings provide concrete targets for the next balancing iteration rather than evidence that the current calibration is final.</w:t>
+      </w:r>
+    </w:p>
+    <w:p>
+      <w:pPr>
+        <w:pStyle w:val="Articlenormaltext"/>
+      </w:pPr>
+      <w:r>
+        <w:t>The computational analysis therefore serves primarily as a structural validation of the game model. It demonstrates that the rules generate a broad range of outcomes and multiple successful building-system configurations, while also identifying individual state mappings and card interactions that require additional review.</w:t>
+      </w:r>
+    </w:p>
+    <w:p>
+      <w:pPr>
+        <w:pStyle w:val="berschrift1"/>
+      </w:pPr>
+      <w:r>
+        <w:t>Discussion</w:t>
+      </w:r>
+    </w:p>
+    <w:p>
+      <w:pPr>
+        <w:pStyle w:val="berschrift2"/>
+      </w:pPr>
+      <w:r>
+        <w:t>Preserving relationships rather than numerical detail</w:t>
+      </w:r>
+    </w:p>
+    <w:p>
+      <w:pPr>
+        <w:pStyle w:val="Articlenormaltextfirstparagraph"/>
+      </w:pPr>
+      <w:r>
+        <w:t xml:space="preserve">The central design problem of </w:t>
+      </w:r>
+      <w:r>
+        <w:rPr>
+          <w:i/>
+        </w:rPr>
+        <w:t>The Renovation Game</w:t>
+      </w:r>
+      <w:r>
+        <w:t xml:space="preserve"> is model reduction. A building-energy model can become more accurate by adding variables and temporal resolution. A tabletop learning model faces the opposite constraint: each additional variable requires additional explanation, state tracking, or arithmetic.</w:t>
+      </w:r>
+    </w:p>
+    <w:p>
+      <w:pPr>
+        <w:pStyle w:val="Articlenormaltext"/>
+      </w:pPr>
+      <w:r>
+        <w:t>The design therefore does not attempt to maximize physical detail. It preserves selected relationships that are both technically important and suitable for decision-based learning.</w:t>
+      </w:r>
+      <w:r>
+        <w:t xml:space="preserve"> </w:t>
+      </w:r>
+      <w:r>
+        <w:t>This distinction can be described as preservation of solution-space geometry. The term does not imply exact mathematical equivalence between the engineering model and the game. It refers to the attempt to retain the direction and relative structure of decisions. Measures that are complementary in the technical system should tend to be complementary in the game. Measures that affect different physical quantities should remain distinct. Large differences should remain visible, while minor differences can be removed.</w:t>
+      </w:r>
+    </w:p>
+    <w:p>
+      <w:pPr>
+        <w:pStyle w:val="Articlenormaltext"/>
+      </w:pPr>
       <w:r>
         <w:lastRenderedPageBreak/>
-        <w:t>distribution and heat-generation measures with photovoltaic generation, electrical efficiency, flexibility, and user-oriented interventions.</w:t>
+        <w:t>The approach is particularly suitable for introductory systems education. Learners can work with the causal structure before they learn the equations needed for a detailed simulation.</w:t>
+      </w:r>
+    </w:p>
+    <w:p>
+      <w:pPr>
+        <w:pStyle w:val="berschrift2"/>
+      </w:pPr>
+      <w:r>
+        <w:t>Endogenous learning content</w:t>
+      </w:r>
+    </w:p>
+    <w:p>
+      <w:pPr>
+        <w:pStyle w:val="Articlenormaltextfirstparagraph"/>
+      </w:pPr>
+      <w:r>
+        <w:t>A central design decision was to make technical content endogenous to the mechanics.</w:t>
+      </w:r>
+      <w:r>
+        <w:t xml:space="preserve"> </w:t>
+      </w:r>
+      <w:r>
+        <w:t>A card could simply state, for example, that low-temperature heating improves heat-pump performance. In the present design, this information is also implemented as a change in the heat-pump efficiency state. The relationship therefore affects electricity demand, operational emissions, and future budget.</w:t>
       </w:r>
     </w:p>
     <w:p>
@@ -9789,7 +9882,7 @@
         <w:pStyle w:val="Articlenormaltext"/>
       </w:pPr>
       <w:r>
-        <w:t>This pattern is consistent with the intended structure of the model, in which the result of a measure can depend on other states. Heat-pump outcomes depend on thermal demand and efficiency; storage interacts with local generation; and budget effects influence the availability of later measures. Consequently, the frequency of an individual card cannot be interpreted as an independent measure of technical effectiveness.</w:t>
+        <w:t>The same principle applies to storage. Players cannot obtain the benefit of a battery by treating it as generation because the game stores electricity production and storage in separate states.</w:t>
       </w:r>
     </w:p>
     <w:p>
@@ -9797,50 +9890,187 @@
         <w:pStyle w:val="Articlenormaltext"/>
       </w:pPr>
       <w:r>
-        <w:t>The exploratory card-level analysis confirms this limitation. Comparing the mean final score of games with and without a specific card produces large apparent differences for some measures, but these differences include selection effects from budget, prerequisites, card availability, and previous measures. Such comparisons are therefore useful as balancing diagnostics rather than causal estimates of card effectiveness.</w:t>
+        <w:t>Embodied emissions provide another example. Their presence in the construction-emission state creates an immediate penalty that is conceptually different from recurring operational emissions. This makes the difference visible without requiring players to understand a full life-cycle assessment.</w:t>
+      </w:r>
+    </w:p>
+    <w:p>
+      <w:pPr>
+        <w:pStyle w:val="Articlenormaltext"/>
+      </w:pPr>
+      <w:r>
+        <w:t>These mechanics do not prove that players learn the intended concepts. They do, however, establish a direct relationship between the concepts and successful interaction with the model.</w:t>
       </w:r>
     </w:p>
     <w:p>
       <w:pPr>
         <w:pStyle w:val="berschrift2"/>
-      </w:pPr>
-      <w:r>
-        <w:t>Implications for model calibration</w:t>
+        <w:rPr>
+          <w:lang w:eastAsia="de-DE"/>
+        </w:rPr>
+      </w:pPr>
+      <w:r>
+        <w:rPr>
+          <w:lang w:eastAsia="de-DE"/>
+        </w:rPr>
+        <w:t>Balance between realism and playability</w:t>
       </w:r>
     </w:p>
     <w:p>
       <w:pPr>
         <w:pStyle w:val="Articlenormaltextfirstparagraph"/>
-      </w:pPr>
-      <w:r>
-        <w:t xml:space="preserve">Overall, the simulation provides two complementary findings. </w:t>
-      </w:r>
-      <w:r>
-        <w:t>First, the major single-use building systems show substantial pathway diversity: several envelope, heat-generation, ventilation, heat-distribution, and roof-use options occur among the best-performing trajectories. This supports the design objective of avoiding one universally prescribed renovation pathway.</w:t>
+        <w:rPr>
+          <w:lang w:eastAsia="de-DE"/>
+        </w:rPr>
+      </w:pPr>
+      <w:r>
+        <w:rPr>
+          <w:lang w:eastAsia="de-DE"/>
+        </w:rPr>
+        <w:t>Calibration repeatedly required trade-offs between physical interpretation and game clarity.</w:t>
+      </w:r>
+      <w:r>
+        <w:rPr>
+          <w:lang w:eastAsia="de-DE"/>
+        </w:rPr>
+        <w:t xml:space="preserve"> </w:t>
+      </w:r>
+      <w:r>
+        <w:rPr>
+          <w:lang w:eastAsia="de-DE"/>
+        </w:rPr>
+        <w:t xml:space="preserve">Some simplifications are </w:t>
+      </w:r>
+      <w:r>
+        <w:rPr>
+          <w:b/>
+          <w:lang w:eastAsia="de-DE"/>
+        </w:rPr>
+        <w:t>straightforward</w:t>
+      </w:r>
+      <w:r>
+        <w:rPr>
+          <w:lang w:eastAsia="de-DE"/>
+        </w:rPr>
+        <w:t>:</w:t>
+      </w:r>
+      <w:r>
+        <w:rPr>
+          <w:lang w:eastAsia="de-DE"/>
+        </w:rPr>
+        <w:t xml:space="preserve"> A continuous heat-demand range can be converted into discrete increments without changing the basic relationship between insulation and demand.</w:t>
       </w:r>
     </w:p>
     <w:p>
       <w:pPr>
         <w:pStyle w:val="Articlenormaltext"/>
-      </w:pPr>
-      <w:r>
-        <w:t>Second, the analysis identifies specific areas for further calibration. Storage and flexibility frequently reach the maximum state, indicating a possible ceiling effect. Several enabling cards occur disproportionately often among the best-performing trajectories, particularly the house-wide electric-car charging infrastructure. These findings provide concrete targets for the next balancing iteration rather than evidence that the current calibration is final.</w:t>
+        <w:rPr>
+          <w:lang w:eastAsia="de-DE"/>
+        </w:rPr>
+      </w:pPr>
+      <w:r>
+        <w:rPr>
+          <w:lang w:eastAsia="de-DE"/>
+        </w:rPr>
+        <w:t xml:space="preserve">Other simplifications are more </w:t>
+      </w:r>
+      <w:r>
+        <w:rPr>
+          <w:b/>
+          <w:lang w:eastAsia="de-DE"/>
+        </w:rPr>
+        <w:t>problematic</w:t>
+      </w:r>
+      <w:r>
+        <w:rPr>
+          <w:lang w:eastAsia="de-DE"/>
+        </w:rPr>
+        <w:t>:</w:t>
+      </w:r>
+      <w:r>
+        <w:rPr>
+          <w:lang w:eastAsia="de-DE"/>
+        </w:rPr>
+        <w:t xml:space="preserve"> Electricity storage, for example, is inherently temporal. An annual state cannot reproduce charging constraints or mismatches between production and demand. The current solution therefore preserves only the general effect of storage on local self-use.</w:t>
       </w:r>
     </w:p>
     <w:p>
       <w:pPr>
         <w:pStyle w:val="Articlenormaltext"/>
-      </w:pPr>
-      <w:r>
-        <w:t>The computational analysis therefore serves primarily as a structural validation of the game model. It demonstrates that the rules generate a broad range of outcomes and multiple successful building-system configurations, while also identifying individual state mappings and card interactions that require additional review.</w:t>
-      </w:r>
-    </w:p>
-    <w:p>
-      <w:pPr>
-        <w:pStyle w:val="berschrift1"/>
-      </w:pPr>
-      <w:r>
-        <w:t>Discussion</w:t>
+        <w:rPr>
+          <w:lang w:eastAsia="de-DE"/>
+        </w:rPr>
+      </w:pPr>
+      <w:r>
+        <w:rPr>
+          <w:b/>
+          <w:lang w:eastAsia="de-DE"/>
+        </w:rPr>
+        <w:t>Costs</w:t>
+      </w:r>
+      <w:r>
+        <w:rPr>
+          <w:lang w:eastAsia="de-DE"/>
+        </w:rPr>
+        <w:t xml:space="preserve"> create another challenge</w:t>
+      </w:r>
+      <w:r>
+        <w:rPr>
+          <w:lang w:eastAsia="de-DE"/>
+        </w:rPr>
+        <w:t xml:space="preserve">: </w:t>
+      </w:r>
+      <w:r>
+        <w:rPr>
+          <w:lang w:eastAsia="de-DE"/>
+        </w:rPr>
+        <w:t>Real renovation costs vary with location, building geometry, procurement, condition, and construction market. The current game therefore uses relative card costs. This is sufficient to create investment constraints but not to teach detailed renovation economics.</w:t>
+      </w:r>
+    </w:p>
+    <w:p>
+      <w:pPr>
+        <w:pStyle w:val="Articlenormaltext"/>
+        <w:rPr>
+          <w:lang w:eastAsia="de-DE"/>
+        </w:rPr>
+      </w:pPr>
+      <w:r>
+        <w:rPr>
+          <w:b/>
+          <w:lang w:eastAsia="de-DE"/>
+        </w:rPr>
+        <w:t>User satisfaction</w:t>
+      </w:r>
+      <w:r>
+        <w:rPr>
+          <w:lang w:eastAsia="de-DE"/>
+        </w:rPr>
+        <w:t xml:space="preserve"> is even more abstract</w:t>
+      </w:r>
+      <w:r>
+        <w:rPr>
+          <w:lang w:eastAsia="de-DE"/>
+        </w:rPr>
+        <w:t xml:space="preserve">: </w:t>
+      </w:r>
+      <w:r>
+        <w:rPr>
+          <w:lang w:eastAsia="de-DE"/>
+        </w:rPr>
+        <w:t>It represents multiple social and comfort-related outcomes through one state. This is useful for preventing a purely technical optimization but should not be interpreted as a quantitative model of occupant behavior.</w:t>
+      </w:r>
+    </w:p>
+    <w:p>
+      <w:pPr>
+        <w:pStyle w:val="Articlenormaltext"/>
+        <w:rPr>
+          <w:lang w:eastAsia="de-DE"/>
+        </w:rPr>
+      </w:pPr>
+      <w:r>
+        <w:rPr>
+          <w:lang w:eastAsia="de-DE"/>
+        </w:rPr>
+        <w:t>These examples suggest a general principle for engineering serious games: a simplified value should only be given a precise physical interpretation when the underlying assumptions support that precision. Where this is not possible, the game should preserve the relationship while clearly communicating the limitation.</w:t>
       </w:r>
     </w:p>
     <w:p>
@@ -9848,7 +10078,7 @@
         <w:pStyle w:val="berschrift2"/>
       </w:pPr>
       <w:r>
-        <w:t>Preserving relationships rather than numerical detail</w:t>
+        <w:t>Computational testing as part of serious-game development</w:t>
       </w:r>
     </w:p>
     <w:p>
@@ -9856,16 +10086,13 @@
         <w:pStyle w:val="Articlenormaltextfirstparagraph"/>
       </w:pPr>
       <w:r>
-        <w:t xml:space="preserve">The central design problem of </w:t>
-      </w:r>
-      <w:r>
-        <w:rPr>
-          <w:i/>
-        </w:rPr>
-        <w:t>The Renovation Game</w:t>
-      </w:r>
-      <w:r>
-        <w:t xml:space="preserve"> is model reduction. A building-energy model can become more accurate by adding variables and temporal resolution. A tabletop learning model faces the opposite constraint: each additional variable requires additional explanation, state tracking, or arithmetic.</w:t>
+        <w:t>Monte Carlo simulation is often used for physical or economic models, but it also has a useful role in serious-game development.</w:t>
+      </w:r>
+      <w:r>
+        <w:t xml:space="preserve"> </w:t>
+      </w:r>
+      <w:r>
+        <w:t>A physical playtest gives information about comprehension, interaction, pacing, and player behavior. It provides limited coverage of the combinatorial state space. Computational simulation provides the opposite strengths. It can test thousands of game paths but cannot determine whether the rules are understandable or engaging.</w:t>
       </w:r>
     </w:p>
     <w:p>
@@ -9873,13 +10100,17 @@
         <w:pStyle w:val="Articlenormaltext"/>
       </w:pPr>
       <w:r>
-        <w:t>The design therefore does not attempt to maximize physical detail. It preserves selected relationships that are both technically important and suitable for decision-based learning.</w:t>
+        <w:t>For a model-driven serious game, these methods should therefore be complementary.</w:t>
       </w:r>
       <w:r>
         <w:t xml:space="preserve"> </w:t>
       </w:r>
       <w:r>
-        <w:t>This distinction can be described as preservation of solution-space geometry. The term does not imply exact mathematical equivalence between the engineering model and the game. It refers to the attempt to retain the direction and relative structure of decisions. Measures that are complementary in the technical system should tend to be complementary in the game. Measures that affect different physical quantities should remain distinct. Large differences should remain visible, while minor differences can be removed.</w:t>
+        <w:t xml:space="preserve">The current randomized policy is intentionally simple. It gives a baseline for structural behavior under card availability and budget constraints. Future versions of the simulation could include </w:t>
+      </w:r>
+      <w:r>
+        <w:lastRenderedPageBreak/>
+        <w:t>heuristic decision policies, such as maximum immediate emission reduction, maximum expected cumulative emission reduction, or emission reduction per budget unit.</w:t>
       </w:r>
     </w:p>
     <w:p>
@@ -9887,7 +10118,7 @@
         <w:pStyle w:val="Articlenormaltext"/>
       </w:pPr>
       <w:r>
-        <w:t>The approach is particularly suitable for introductory systems education. Learners can work with the causal structure before they learn the equations needed for a detailed simulation.</w:t>
+        <w:t>Such policies would permit stronger tests of strategic differentiation. They could establish whether knowledge of technical interactions provides a systematic advantage over simple greedy selection.</w:t>
       </w:r>
     </w:p>
     <w:p>
@@ -9895,270 +10126,6 @@
         <w:pStyle w:val="berschrift2"/>
       </w:pPr>
       <w:r>
-        <w:t>Endogenous learning content</w:t>
-      </w:r>
-    </w:p>
-    <w:p>
-      <w:pPr>
-        <w:pStyle w:val="Articlenormaltextfirstparagraph"/>
-      </w:pPr>
-      <w:r>
-        <w:lastRenderedPageBreak/>
-        <w:t>A central design decision was to make technical content endogenous to the mechanics.</w:t>
-      </w:r>
-      <w:r>
-        <w:t xml:space="preserve"> </w:t>
-      </w:r>
-      <w:r>
-        <w:t>A card could simply state, for example, that low-temperature heating improves heat-pump performance. In the present design, this information is also implemented as a change in the heat-pump efficiency state. The relationship therefore affects electricity demand, operational emissions, and future budget.</w:t>
-      </w:r>
-    </w:p>
-    <w:p>
-      <w:pPr>
-        <w:pStyle w:val="Articlenormaltext"/>
-      </w:pPr>
-      <w:r>
-        <w:t>The same principle applies to storage. Players cannot obtain the benefit of a battery by treating it as generation because the game stores electricity production and storage in separate states.</w:t>
-      </w:r>
-    </w:p>
-    <w:p>
-      <w:pPr>
-        <w:pStyle w:val="Articlenormaltext"/>
-      </w:pPr>
-      <w:r>
-        <w:t>Embodied emissions provide another example. Their presence in the construction-emission state creates an immediate penalty that is conceptually different from recurring operational emissions. This makes the difference visible without requiring players to understand a full life-cycle assessment.</w:t>
-      </w:r>
-    </w:p>
-    <w:p>
-      <w:pPr>
-        <w:pStyle w:val="Articlenormaltext"/>
-      </w:pPr>
-      <w:r>
-        <w:t>These mechanics do not prove that players learn the intended concepts. They do, however, establish a direct relationship between the concepts and successful interaction with the model.</w:t>
-      </w:r>
-    </w:p>
-    <w:p>
-      <w:pPr>
-        <w:pStyle w:val="berschrift2"/>
-        <w:rPr>
-          <w:lang w:eastAsia="de-DE"/>
-        </w:rPr>
-      </w:pPr>
-      <w:r>
-        <w:rPr>
-          <w:lang w:eastAsia="de-DE"/>
-        </w:rPr>
-        <w:t>Balance between realism and playability</w:t>
-      </w:r>
-    </w:p>
-    <w:p>
-      <w:pPr>
-        <w:pStyle w:val="Articlenormaltextfirstparagraph"/>
-        <w:rPr>
-          <w:lang w:eastAsia="de-DE"/>
-        </w:rPr>
-      </w:pPr>
-      <w:r>
-        <w:rPr>
-          <w:lang w:eastAsia="de-DE"/>
-        </w:rPr>
-        <w:t>Calibration repeatedly required trade-offs between physical interpretation and game clarity.</w:t>
-      </w:r>
-      <w:r>
-        <w:rPr>
-          <w:lang w:eastAsia="de-DE"/>
-        </w:rPr>
-        <w:t xml:space="preserve"> </w:t>
-      </w:r>
-      <w:r>
-        <w:rPr>
-          <w:lang w:eastAsia="de-DE"/>
-        </w:rPr>
-        <w:t xml:space="preserve">Some simplifications are </w:t>
-      </w:r>
-      <w:r>
-        <w:rPr>
-          <w:b/>
-          <w:lang w:eastAsia="de-DE"/>
-        </w:rPr>
-        <w:t>straightforward</w:t>
-      </w:r>
-      <w:r>
-        <w:rPr>
-          <w:lang w:eastAsia="de-DE"/>
-        </w:rPr>
-        <w:t>:</w:t>
-      </w:r>
-      <w:r>
-        <w:rPr>
-          <w:lang w:eastAsia="de-DE"/>
-        </w:rPr>
-        <w:t xml:space="preserve"> A continuous heat-demand range can be converted into discrete increments without changing the basic relationship between insulation and demand.</w:t>
-      </w:r>
-    </w:p>
-    <w:p>
-      <w:pPr>
-        <w:pStyle w:val="Articlenormaltext"/>
-        <w:rPr>
-          <w:lang w:eastAsia="de-DE"/>
-        </w:rPr>
-      </w:pPr>
-      <w:r>
-        <w:rPr>
-          <w:lang w:eastAsia="de-DE"/>
-        </w:rPr>
-        <w:t xml:space="preserve">Other simplifications are more </w:t>
-      </w:r>
-      <w:r>
-        <w:rPr>
-          <w:b/>
-          <w:lang w:eastAsia="de-DE"/>
-        </w:rPr>
-        <w:t>problematic</w:t>
-      </w:r>
-      <w:r>
-        <w:rPr>
-          <w:lang w:eastAsia="de-DE"/>
-        </w:rPr>
-        <w:t>:</w:t>
-      </w:r>
-      <w:r>
-        <w:rPr>
-          <w:lang w:eastAsia="de-DE"/>
-        </w:rPr>
-        <w:t xml:space="preserve"> Electricity storage, for example, is inherently temporal. An annual state cannot reproduce charging constraints or mismatches between production and demand. The current solution therefore preserves only the general effect of storage on local self-use.</w:t>
-      </w:r>
-    </w:p>
-    <w:p>
-      <w:pPr>
-        <w:pStyle w:val="Articlenormaltext"/>
-        <w:rPr>
-          <w:lang w:eastAsia="de-DE"/>
-        </w:rPr>
-      </w:pPr>
-      <w:r>
-        <w:rPr>
-          <w:b/>
-          <w:lang w:eastAsia="de-DE"/>
-        </w:rPr>
-        <w:t>Costs</w:t>
-      </w:r>
-      <w:r>
-        <w:rPr>
-          <w:lang w:eastAsia="de-DE"/>
-        </w:rPr>
-        <w:t xml:space="preserve"> create another challenge</w:t>
-      </w:r>
-      <w:r>
-        <w:rPr>
-          <w:lang w:eastAsia="de-DE"/>
-        </w:rPr>
-        <w:t xml:space="preserve">: </w:t>
-      </w:r>
-      <w:r>
-        <w:rPr>
-          <w:lang w:eastAsia="de-DE"/>
-        </w:rPr>
-        <w:t>Real renovation costs vary with location, building geometry, procurement, condition, and construction market. The current game therefore uses relative card costs. This is sufficient to create investment constraints but not to teach detailed renovation economics.</w:t>
-      </w:r>
-    </w:p>
-    <w:p>
-      <w:pPr>
-        <w:pStyle w:val="Articlenormaltext"/>
-        <w:rPr>
-          <w:lang w:eastAsia="de-DE"/>
-        </w:rPr>
-      </w:pPr>
-      <w:r>
-        <w:rPr>
-          <w:b/>
-          <w:lang w:eastAsia="de-DE"/>
-        </w:rPr>
-        <w:t>User satisfaction</w:t>
-      </w:r>
-      <w:r>
-        <w:rPr>
-          <w:lang w:eastAsia="de-DE"/>
-        </w:rPr>
-        <w:t xml:space="preserve"> is even more abstract</w:t>
-      </w:r>
-      <w:r>
-        <w:rPr>
-          <w:lang w:eastAsia="de-DE"/>
-        </w:rPr>
-        <w:t xml:space="preserve">: </w:t>
-      </w:r>
-      <w:r>
-        <w:rPr>
-          <w:lang w:eastAsia="de-DE"/>
-        </w:rPr>
-        <w:t>It represents multiple social and comfort-related outcomes through one state. This is useful for preventing a purely technical optimization but should not be interpreted as a quantitative model of occupant behavior.</w:t>
-      </w:r>
-    </w:p>
-    <w:p>
-      <w:pPr>
-        <w:pStyle w:val="Articlenormaltext"/>
-        <w:rPr>
-          <w:lang w:eastAsia="de-DE"/>
-        </w:rPr>
-      </w:pPr>
-      <w:r>
-        <w:rPr>
-          <w:lang w:eastAsia="de-DE"/>
-        </w:rPr>
-        <w:t>These examples suggest a general principle for engineering serious games: a simplified value should only be given a precise physical interpretation when the underlying assumptions support that precision. Where this is not possible, the game should preserve the relationship while clearly communicating the limitation.</w:t>
-      </w:r>
-    </w:p>
-    <w:p>
-      <w:pPr>
-        <w:pStyle w:val="berschrift2"/>
-      </w:pPr>
-      <w:r>
-        <w:t>Computational testing as part of serious-game development</w:t>
-      </w:r>
-    </w:p>
-    <w:p>
-      <w:pPr>
-        <w:pStyle w:val="Articlenormaltextfirstparagraph"/>
-      </w:pPr>
-      <w:r>
-        <w:t>Monte Carlo simulation is often used for physical or economic models, but it also has a useful role in serious-game development.</w:t>
-      </w:r>
-      <w:r>
-        <w:t xml:space="preserve"> </w:t>
-      </w:r>
-      <w:r>
-        <w:t>A physical playtest gives information about comprehension, interaction, pacing, and player behavior. It provides limited coverage of the combinatorial state space. Computational simulation provides the opposite strengths. It can test thousands of game paths but cannot determine whether the rules are understandable or engaging.</w:t>
-      </w:r>
-    </w:p>
-    <w:p>
-      <w:pPr>
-        <w:pStyle w:val="Articlenormaltext"/>
-      </w:pPr>
-      <w:r>
-        <w:t>For a model-driven serious game, these methods should therefore be complementary.</w:t>
-      </w:r>
-      <w:r>
-        <w:t xml:space="preserve"> </w:t>
-      </w:r>
-      <w:r>
-        <w:t>The current randomized policy is intentionally simple. It gives a baseline for structural behavior under card availability and budget constraints. Future versions of the simulation could include heuristic decision policies, such as maximum immediate emission reduction, maximum expected cumulative emission reduction, or emission reduction per budget unit.</w:t>
-      </w:r>
-    </w:p>
-    <w:p>
-      <w:pPr>
-        <w:pStyle w:val="Articlenormaltext"/>
-      </w:pPr>
-      <w:r>
-        <w:t>Such policies would permit stronger tests of strategic differentiation. They could establish whether knowledge of technical interactions provides a systematic advantage over simple greedy selection.</w:t>
-      </w:r>
-    </w:p>
-    <w:p>
-      <w:pPr>
-        <w:pStyle w:val="berschrift2"/>
-      </w:pPr>
-      <w:r>
-        <w:lastRenderedPageBreak/>
         <w:t>Educational evaluation as a separate question</w:t>
       </w:r>
     </w:p>
@@ -10344,6 +10311,7 @@
         <w:pStyle w:val="Bulletlist"/>
       </w:pPr>
       <w:r>
+        <w:lastRenderedPageBreak/>
         <w:t>Second, the model uses discrete annual states. It omits weather, hourly demand profiles, thermal mass, detailed component performance, hydraulic behavior, and building controls.</w:t>
       </w:r>
     </w:p>
@@ -10368,7 +10336,6 @@
         <w:pStyle w:val="Bulletlist"/>
       </w:pPr>
       <w:r>
-        <w:lastRenderedPageBreak/>
         <w:t>Fifth, the electricity decarbonization pathway is scenario-dependent. Different assumptions can change the relative value of electrification and flexibility.</w:t>
       </w:r>
     </w:p>
@@ -10571,19 +10538,7 @@
         <w:rPr>
           <w:lang w:eastAsia="de-DE"/>
         </w:rPr>
-        <w:t xml:space="preserve">the City of Vienna Municipal department </w:t>
-      </w:r>
-      <w:r>
-        <w:rPr>
-          <w:lang w:eastAsia="de-DE"/>
-        </w:rPr>
-        <w:t>MA23</w:t>
-      </w:r>
-      <w:r>
-        <w:rPr>
-          <w:lang w:eastAsia="de-DE"/>
-        </w:rPr>
-        <w:t>.</w:t>
+        <w:t>the City of Vienna Municipal department MA23.</w:t>
       </w:r>
     </w:p>
     <w:p>
@@ -10620,7 +10575,6 @@
         <w:rPr>
           <w:lang w:eastAsia="de-DE"/>
         </w:rPr>
-        <w:lastRenderedPageBreak/>
         <w:t>The game model is implemented in Python for automated simulation and balancing. The repository contains the simulation code, analysis notebooks, print material, and associated game data</w:t>
       </w:r>
       <w:r>
@@ -13445,6 +13399,7 @@
   <w:style w:type="character" w:default="1" w:styleId="Absatz-Standardschriftart">
     <w:name w:val="Default Paragraph Font"/>
     <w:uiPriority w:val="1"/>
+    <w:semiHidden/>
     <w:unhideWhenUsed/>
   </w:style>
   <w:style w:type="table" w:default="1" w:styleId="NormaleTabelle">

</xml_diff>